<commit_message>
fix(lecons): trois corrections sur la leçon dzogchen n°13 (bardos)
- Pont pro : « les RBPP HAS » invoquées sans titre ni date, et
  « culture palliative inclusive » n'est pas une formulation HAS. Deux
  recommandations nommées et ajoutées en ressources (fin de vie en
  Ehpad ; accompagnement à la santé de la personne handicapée, 2013),
  testées ce jour. Le paragraphe sépare désormais ce qui est fondé
  dans les textes de ce qui relève de la préparation personnelle.
- Ajout d'un passage sur la réception occidentale du Bardo Thödol :
  Evans-Wentz (Oxford, 1927), qui ne lisait pas le tibétain, approche
  décrite comme « théosophique et védantiste », commentaire de Jung
  en 1965 — le tout tiré de la page que la leçon citait déjà.
- Sources : Jean-Luc Achard était cité via un blog personnel ; ajout
  de la Revue d'Études Tibétaines (CNRS/CRCAO) qu'il dirige.

Formulations d'origine conservées dans le journal des corrections.

Co-Authored-By: Claude Opus 5 <noreply@anthropic.com>
</commit_message>
<xml_diff>
--- a/livrables/lecons/2026-08-25_lecon-dzogchen_13_bardos-processus-mort.docx
+++ b/livrables/lecons/2026-08-25_lecon-dzogchen_13_bardos-processus-mort.docx
@@ -746,6 +746,34 @@
     </w:p>
     <w:p>
       <w:pPr>
+        <w:spacing w:after="120"/>
+      </w:pPr>
+      <w:r>
+        <w:rPr>
+          <w:rFonts w:ascii="Times New Roman" w:cs="Times New Roman" w:eastAsia="Times New Roman" w:hAnsi="Times New Roman"/>
+          <w:color w:val="1F2937"/>
+          <w:sz w:val="22"/>
+          <w:szCs w:val="22"/>
+        </w:rPr>
+        <w:t xml:space="preserve">Ce que le titre occidental doit à la théosophie. Le nom sous lequel le texte est connu hors du Tibet — « Le Livre tibétain des morts » — n'est pas tibétain : il vient de la première traduction anglaise, publiée en 1927 chez Oxford University Press par Walter Evans-Wentz. Celui-ci ne lisait pas le tibétain ; le travail de traduction revient pour l'essentiel à Lama Kazi Dawa Samdup. La page de référence consultée pour cette leçon décrit l'approche d'Evans-Wentz comme « ni tibétaine ni bouddhiste, mais théosophique et védantiste », et l'édition révisée de 1965 y ajoute un commentaire psychologique de Carl Jung, qui rapproche les phénomènes du bardo des contenus inconscients de sa propre théorie.</w:t>
+      </w:r>
+    </w:p>
+    <w:p>
+      <w:pPr>
+        <w:spacing w:after="120"/>
+      </w:pPr>
+      <w:r>
+        <w:rPr>
+          <w:rFonts w:ascii="Times New Roman" w:cs="Times New Roman" w:eastAsia="Times New Roman" w:hAnsi="Times New Roman"/>
+          <w:color w:val="1F2937"/>
+          <w:sz w:val="22"/>
+          <w:szCs w:val="22"/>
+        </w:rPr>
+        <w:t xml:space="preserve">Pourquoi le signaler ici : une part de ce qui circule en français sous le nom de « bardo » vient de cette couche de lecture occidentale, vieille d'un siècle, et non du corpus tibétain lui-même. Savoir dater une reformulation ne disqualifie rien — cela permet de savoir à quel registre appartient ce qu'on lit.</w:t>
+      </w:r>
+    </w:p>
+    <w:p>
+      <w:pPr>
         <w:shd w:fill="F3F4F6" w:val="clear"/>
         <w:spacing w:after="120"/>
         <w:ind w:left="500"/>
@@ -1528,7 +1556,7 @@
           <w:sz w:val="22"/>
           <w:szCs w:val="22"/>
         </w:rPr>
-        <w:t xml:space="preserve">Dans l'accompagnement des adultes en situation de handicap mental ou psychique, la question de la mort est souvent esquivée. Or les RBPP HAS sur l'accompagnement en ESSMS soulignent l'importance d'une culture palliative inclusive. La conscience des bardos — et en particulier l'idée que la mort n'est pas un mur mais une série d'états traversables avec présence — peut nourrir une posture soignante : rester présent, parler doucement, éviter de laisser la personne seule à l'heure du passage. C'est une dimension qui ne s'enseigne pas en réunion d'équipe, mais qui infuse dans la qualité de présence des professionnels.</w:t>
+        <w:t xml:space="preserve">Dans l'accompagnement des adultes en situation de handicap mental ou psychique, la question de la mort est souvent esquivée. Les recommandations de bonne pratique de l'ANESM, reprises par la HAS, en traitent précisément : « Accompagner la fin de vie des personnes âgées en Ehpad » — donnée comme utile aux établissements accueillant des personnes handicapées vieillissantes — et « L'accompagnement à la santé de la personne handicapée » (juillet 2013). Ce sont elles qu'il faut citer, et non « les RBPP » en général : une recommandation sans titre ni date ne tient pas devant un évaluateur. La conscience des bardos — et en particulier l'idée que la mort n'est pas un mur mais une série d'états traversables avec présence — peut nourrir une posture soignante : rester présent, parler doucement, éviter de laisser la personne seule à l'heure du passage. À tenir clairement séparé, toutefois : les gestes recommandés — rester présent, parler doucement, ne pas laisser la personne seule — sont fondés dans ces recommandations, sans avoir besoin d'une cosmologie pour les justifier. Ce que le parcours apporte ici relève de TA préparation personnelle, pas d'un contenu à transmettre en réunion d'équipe ni d'une justification opposable dans un projet d'établissement.</w:t>
       </w:r>
     </w:p>
     <w:p>
@@ -1623,7 +1651,7 @@
             <w:szCs w:val="22"/>
             <w:u w:val="single"/>
           </w:rPr>
-          <w:t xml:space="preserve">Bardo Thodol — Wikipedia (EN) : composition, structure, Karma Lingpa, Padmasambhava, claire lumière</w:t>
+          <w:t xml:space="preserve">Bardo Thodol — Wikipedia (EN) : composition, structure, Karma Lingpa, Padmasambhava — et surtout la section sur la réception occidentale du texte (Evans-Wentz, Jung). Source tertiaire : bonne pour se repérer, à ne pas citer comme référence</w:t>
         </w:r>
       </w:hyperlink>
     </w:p>
@@ -1675,7 +1703,7 @@
             <w:szCs w:val="22"/>
             <w:u w:val="single"/>
           </w:rPr>
-          <w:t xml:space="preserve">Khyung-Mkhar (blog) — La voie Dzogchen de la Claire-Lumière (Jean-Luc Achard) : claire lumière, phowa, Shardza Rinpoche</w:t>
+          <w:t xml:space="preserve">Khyung-Mkhar (blog) — La voie Dzogchen de la Claire-Lumière : reprend des travaux de Jean-Luc Achard. ⚠️ Blog personnel, non éditorialisé — pour les travaux d'Achard, préférer la revue à comité de lecture qu'il dirige, ci-dessous</w:t>
         </w:r>
       </w:hyperlink>
     </w:p>
@@ -1707,6 +1735,98 @@
     </w:p>
     <w:p>
       <w:pPr>
+        <w:spacing w:after="120"/>
+      </w:pPr>
+      <w:r>
+        <w:rPr>
+          <w:rFonts w:ascii="Times New Roman" w:cs="Times New Roman" w:eastAsia="Times New Roman" w:hAnsi="Times New Roman"/>
+          <w:color w:val="1F2937"/>
+          <w:sz w:val="22"/>
+          <w:szCs w:val="22"/>
+        </w:rPr>
+        <w:t xml:space="preserve">Sources ajoutées le 25/08/2026, testées ce jour (200) :</w:t>
+      </w:r>
+    </w:p>
+    <w:p>
+      <w:pPr>
+        <w:spacing w:after="120"/>
+      </w:pPr>
+      <w:r>
+        <w:rPr>
+          <w:rFonts w:ascii="Times New Roman" w:cs="Times New Roman" w:eastAsia="Times New Roman" w:hAnsi="Times New Roman"/>
+          <w:color w:val="1F2937"/>
+          <w:sz w:val="22"/>
+          <w:szCs w:val="22"/>
+        </w:rPr>
+        <w:t xml:space="preserve">→ </w:t>
+      </w:r>
+      <w:hyperlink w:history="1" r:id="rIdretachardcrcaocnrs1">
+        <w:r>
+          <w:rPr>
+            <w:rFonts w:ascii="Times New Roman" w:cs="Times New Roman" w:eastAsia="Times New Roman" w:hAnsi="Times New Roman"/>
+            <w:color w:val="1155CC"/>
+            <w:sz w:val="22"/>
+            <w:szCs w:val="22"/>
+            <w:u w:val="single"/>
+          </w:rPr>
+          <w:t xml:space="preserve">Revue d'Études Tibétaines (CNRS / CRCAO, UMR 8155) — revue à comité de lecture dirigée par Jean-Luc Achard, tous les numéros en accès libre. La référence à citer pour ses travaux, plutôt qu'un blog.</w:t>
+        </w:r>
+      </w:hyperlink>
+    </w:p>
+    <w:p>
+      <w:pPr>
+        <w:spacing w:after="120"/>
+      </w:pPr>
+      <w:r>
+        <w:rPr>
+          <w:rFonts w:ascii="Times New Roman" w:cs="Times New Roman" w:eastAsia="Times New Roman" w:hAnsi="Times New Roman"/>
+          <w:color w:val="1F2937"/>
+          <w:sz w:val="22"/>
+          <w:szCs w:val="22"/>
+        </w:rPr>
+        <w:t xml:space="preserve">→ </w:t>
+      </w:r>
+      <w:hyperlink w:history="1" r:id="rIdhasfindevieehpad202">
+        <w:r>
+          <w:rPr>
+            <w:rFonts w:ascii="Times New Roman" w:cs="Times New Roman" w:eastAsia="Times New Roman" w:hAnsi="Times New Roman"/>
+            <w:color w:val="1155CC"/>
+            <w:sz w:val="22"/>
+            <w:szCs w:val="22"/>
+            <w:u w:val="single"/>
+          </w:rPr>
+          <w:t xml:space="preserve">HAS / ANESM — Accompagner la fin de vie des personnes âgées en Ehpad : la recommandation que le pont professionnel invoquait sans la nommer, donnée comme utile aux établissements accueillant des personnes handicapées vieillissantes.</w:t>
+        </w:r>
+      </w:hyperlink>
+    </w:p>
+    <w:p>
+      <w:pPr>
+        <w:spacing w:after="120"/>
+      </w:pPr>
+      <w:r>
+        <w:rPr>
+          <w:rFonts w:ascii="Times New Roman" w:cs="Times New Roman" w:eastAsia="Times New Roman" w:hAnsi="Times New Roman"/>
+          <w:color w:val="1F2937"/>
+          <w:sz w:val="22"/>
+          <w:szCs w:val="22"/>
+        </w:rPr>
+        <w:t xml:space="preserve">→ </w:t>
+      </w:r>
+      <w:hyperlink w:history="1" r:id="rIdanesmsantehandicap13">
+        <w:r>
+          <w:rPr>
+            <w:rFonts w:ascii="Times New Roman" w:cs="Times New Roman" w:eastAsia="Times New Roman" w:hAnsi="Times New Roman"/>
+            <w:color w:val="1155CC"/>
+            <w:sz w:val="22"/>
+            <w:szCs w:val="22"/>
+            <w:u w:val="single"/>
+          </w:rPr>
+          <w:t xml:space="preserve">ANESM — L'accompagnement à la santé de la personne handicapée (juillet 2013) : le volet santé, fin de vie comprise, pour le secteur du handicap.</w:t>
+        </w:r>
+      </w:hyperlink>
+    </w:p>
+    <w:p>
+      <w:pPr>
         <w:spacing w:after="100"/>
       </w:pPr>
       <w:r>
@@ -1812,6 +1932,134 @@
           <w:szCs w:val="20"/>
         </w:rPr>
         <w:t xml:space="preserve">Parcours Dzogchen — Leçon 13/20 · 25 août 2026 · Usage personnel</w:t>
+      </w:r>
+    </w:p>
+    <w:p>
+      <w:pPr>
+        <w:spacing w:after="120" w:before="320"/>
+      </w:pPr>
+      <w:r>
+        <w:rPr>
+          <w:rFonts w:ascii="Times New Roman" w:cs="Times New Roman" w:eastAsia="Times New Roman" w:hAnsi="Times New Roman"/>
+          <w:b/>
+          <w:bCs/>
+          <w:color w:val="1B3A6B"/>
+          <w:sz w:val="30"/>
+          <w:szCs w:val="30"/>
+        </w:rPr>
+        <w:t xml:space="preserve">📝 Journal des corrections</w:t>
+      </w:r>
+    </w:p>
+    <w:p>
+      <w:pPr>
+        <w:spacing w:after="120"/>
+      </w:pPr>
+      <w:r>
+        <w:rPr>
+          <w:rFonts w:ascii="Times New Roman" w:cs="Times New Roman" w:eastAsia="Times New Roman" w:hAnsi="Times New Roman"/>
+          <w:color w:val="1F2937"/>
+          <w:sz w:val="22"/>
+          <w:szCs w:val="22"/>
+        </w:rPr>
+        <w:t xml:space="preserve">Leçon produite et relue le 25/08/2026. Les corrections sont fondues dans le texte ci-dessus ; les formulations d'origine sont conservées ici.</w:t>
+      </w:r>
+    </w:p>
+    <w:p>
+      <w:pPr>
+        <w:spacing w:after="120"/>
+      </w:pPr>
+      <w:r>
+        <w:rPr>
+          <w:rFonts w:ascii="Times New Roman" w:cs="Times New Roman" w:eastAsia="Times New Roman" w:hAnsi="Times New Roman"/>
+          <w:color w:val="1F2937"/>
+          <w:sz w:val="22"/>
+          <w:szCs w:val="22"/>
+        </w:rPr>
+        <w:t xml:space="preserve">1. Pont professionnel — une RBPP invoquée sans être nommée.</w:t>
+      </w:r>
+    </w:p>
+    <w:p>
+      <w:pPr>
+        <w:spacing w:after="120"/>
+      </w:pPr>
+      <w:r>
+        <w:rPr>
+          <w:rFonts w:ascii="Times New Roman" w:cs="Times New Roman" w:eastAsia="Times New Roman" w:hAnsi="Times New Roman"/>
+          <w:color w:val="1F2937"/>
+          <w:sz w:val="22"/>
+          <w:szCs w:val="22"/>
+        </w:rPr>
+        <w:t xml:space="preserve">Version initiale : « Or les RBPP HAS sur l'accompagnement en ESSMS soulignent l'importance d'une culture palliative inclusive. » Aucune recommandation n'était citée, et « culture palliative inclusive » n'est pas une formulation de la HAS. Deux recommandations existent pourtant et se nomment : « Accompagner la fin de vie des personnes âgées en Ehpad » (ANESM, reprise par la HAS), explicitement présentée comme utile aux établissements accueillant des personnes handicapées vieillissantes, et « L'accompagnement à la santé de la personne handicapée » (ANESM, juillet 2013). Les deux ont été ajoutées en ressources, testées le 25/08/2026. Le paragraphe précise désormais que les gestes recommandés — rester présent, parler doucement, ne pas laisser la personne seule — sont fondés dans ces textes sans nécessiter de cosmologie, et que ce que le parcours apporte relève de la préparation personnelle, non d'un contenu à transmettre en équipe.</w:t>
+      </w:r>
+    </w:p>
+    <w:p>
+      <w:pPr>
+        <w:spacing w:after="120"/>
+      </w:pPr>
+      <w:r>
+        <w:rPr>
+          <w:rFonts w:ascii="Times New Roman" w:cs="Times New Roman" w:eastAsia="Times New Roman" w:hAnsi="Times New Roman"/>
+          <w:color w:val="1F2937"/>
+          <w:sz w:val="22"/>
+          <w:szCs w:val="22"/>
+        </w:rPr>
+        <w:t xml:space="preserve">2. Réception occidentale du Bardo Thödol — un ajout, pas une correction.</w:t>
+      </w:r>
+    </w:p>
+    <w:p>
+      <w:pPr>
+        <w:spacing w:after="120"/>
+      </w:pPr>
+      <w:r>
+        <w:rPr>
+          <w:rFonts w:ascii="Times New Roman" w:cs="Times New Roman" w:eastAsia="Times New Roman" w:hAnsi="Times New Roman"/>
+          <w:color w:val="1F2937"/>
+          <w:sz w:val="22"/>
+          <w:szCs w:val="22"/>
+        </w:rPr>
+        <w:t xml:space="preserve">La leçon distinguait honnêtement le Bardo Thödol des enseignements dzogchen, mais ne disait rien de l'histoire du texte en Occident, alors qu'elle citait la Theosophical Society en ressource. La page Wikipédia qu'elle utilise indique que le titre « Livre tibétain des morts » vient de la traduction d'Evans-Wentz (Oxford University Press, 1927), que celui-ci ne lisait pas le tibétain — le travail revenant pour l'essentiel à Lama Kazi Dawa Samdup — et que son approche y est décrite comme « ni tibétaine ni bouddhiste, mais théosophique et védantiste » ; l'édition de 1965 ajoute le commentaire de Carl Jung. Un paragraphe le dit maintenant, avec sa raison d'être : dater une reformulation ne disqualifie rien, cela situe le registre de ce qu'on lit.</w:t>
+      </w:r>
+    </w:p>
+    <w:p>
+      <w:pPr>
+        <w:spacing w:after="120"/>
+      </w:pPr>
+      <w:r>
+        <w:rPr>
+          <w:rFonts w:ascii="Times New Roman" w:cs="Times New Roman" w:eastAsia="Times New Roman" w:hAnsi="Times New Roman"/>
+          <w:color w:val="1F2937"/>
+          <w:sz w:val="22"/>
+          <w:szCs w:val="22"/>
+        </w:rPr>
+        <w:t xml:space="preserve">3. Sources — Achard référencé correctement, Wikipédia rétrogradée.</w:t>
+      </w:r>
+    </w:p>
+    <w:p>
+      <w:pPr>
+        <w:spacing w:after="120"/>
+      </w:pPr>
+      <w:r>
+        <w:rPr>
+          <w:rFonts w:ascii="Times New Roman" w:cs="Times New Roman" w:eastAsia="Times New Roman" w:hAnsi="Times New Roman"/>
+          <w:color w:val="1F2937"/>
+          <w:sz w:val="22"/>
+          <w:szCs w:val="22"/>
+        </w:rPr>
+        <w:t xml:space="preserve">Jean-Luc Achard était cité via un blog personnel. Il dirige la Revue d'Études Tibétaines (CNRS / CRCAO, UMR 8155), à comité de lecture et en accès libre : c'est cette référence qui a été ajoutée, le blog étant conservé mais signalé comme non éditorialisé. L'entrée Wikipédia sur le Bardo Thödol est signalée comme source tertiaire, et son intérêt réel — la section sur la réception occidentale — est indiqué.</w:t>
+      </w:r>
+    </w:p>
+    <w:p>
+      <w:pPr>
+        <w:spacing w:after="120"/>
+      </w:pPr>
+      <w:r>
+        <w:rPr>
+          <w:rFonts w:ascii="Times New Roman" w:cs="Times New Roman" w:eastAsia="Times New Roman" w:hAnsi="Times New Roman"/>
+          <w:color w:val="1F2937"/>
+          <w:sz w:val="22"/>
+          <w:szCs w:val="22"/>
+        </w:rPr>
+        <w:t xml:space="preserve">Vérifié lors de la relecture et inchangé : les six bardos et leurs noms tibétains ; les dates de Karma Lingpa (1326-1386) et l'attribution du terma ; l'ordre de la dissolution des éléments (terre, eau, feu, air, conscience) ; les sept jours de déités paisibles puis courroucées ; et la thèse centrale — la claire lumière se lève pour tous les êtres, seule sa reconnaissance distingue.</w:t>
       </w:r>
     </w:p>
     <w:sectPr>

</xml_diff>